<commit_message>
Atualiza TDR do site público com o diagnóstico técnico aprofundado
Incorpora ao TDR os achados da análise do painel público atual: contexto
descreve as 3 abas existentes e as funções públicas de banco (fn_publico_*),
lacunas verificadas (sem dados financeiros públicos, sem linha do tempo,
sem galeria de produtos, sem SEO, arquitetura monolítica, monoidioma) e
produtos com escopo técnico preciso — regra de privacidade de dados,
7 páginas, novas funções públicas agregadas, porte do mapa/matriz,
bilinguismo parcial e meta Lighthouse >= 90.

Co-Authored-By: Claude Fable 5 <noreply@anthropic.com>
Claude-Session: https://claude.ai/code/session_01PeZvrL4BomaQi9duFRV3ck
</commit_message>
<xml_diff>
--- a/docs/tdrs/TDR_Consultor_Individual_Site_Publico_DIMA.docx
+++ b/docs/tdrs/TDR_Consultor_Individual_Site_Publico_DIMA.docx
@@ -89,7 +89,7 @@
               <w:t>Objetivo Imediato: Fortalecer a resiliência ambiental na APA Lago do Amapá e Igarapé São Francisco, no município de Rio Branco e nos demais municípios da bacia do Rio Acre, com ações de comunicação, visibilidade e prestação de contas do Projeto 218BRA2001.</w:t>
               <w:br/>
               <w:br/>
-              <w:t>Resultado Esperado: Ampliar a transparência e a visibilidade pública da execução física e financeira do projeto, por meio da qualificação dos canais digitais de comunicação com a sociedade civil, doadores e instituições parceiras.</w:t>
+              <w:t>Resultado Esperado: Ampliar a transparência e a visibilidade pública da execução física e financeira do projeto, por meio da evolução do painel público existente para um site público completo, incluindo a publicização — hoje inexistente — da execução financeira agregada, da linha do tempo de entregas e dos produtos técnicos aprovados.</w:t>
               <w:br/>
               <w:br/>
               <w:t>Atividade Vinculada: [Comunicação, Visibilidade e Prestação de Contas do Projeto – código a confirmar junto à Matriz Lógica / PRODOC 218BRA2001]</w:t>
@@ -218,7 +218,7 @@
           <w:b w:val="0"/>
           <w:i w:val="0"/>
         </w:rPr>
-        <w:t>Contratação de consultor(a) individual (pessoa física), com perfil técnico em desenvolvimento de sites e sistemas web e em comunicação de dados socioambientais, para realizar o diagnóstico dos dados disponíveis na Plataforma DIMA (sistema de gestão do Projeto 218BRA2001), projetar a arquitetura de informação e a interface, e desenvolver um site público moderno de divulgação da execução do projeto, em substituição e ampliação da atual página pública, hoje limitada a um mapa de entregas e a um conjunto reduzido de indicadores.</w:t>
+        <w:t>Contratação de consultor(a) individual (pessoa física), com perfil técnico em desenvolvimento de sites e sistemas web e em comunicação de dados socioambientais, para realizar o diagnóstico dos dados disponíveis na Plataforma DIMA (sistema de gestão do Projeto 218BRA2001), projetar a arquitetura de informação e a interface, e desenvolver um site público moderno de divulgação da execução do projeto, evoluindo o atual painel público (mapa de entregas, painel geral e matriz de resultados) para um site multipágina com identidade própria, incorporando transparência financeira agregada, linha do tempo de entregas, galeria de produtos técnicos aprovados e página institucional.</w:t>
       </w:r>
     </w:p>
     <w:p>
@@ -246,7 +246,17 @@
           <w:b w:val="0"/>
           <w:i w:val="0"/>
         </w:rPr>
-        <w:t>Atualmente, a divulgação pública dessa execução ocorre por meio de uma página simplificada, que apresenta apenas um mapa de entregas e um número reduzido de indicadores, sem aproveitar a profundidade e a estrutura dos dados já organizados na plataforma. A própria plataforma já possui uma Edge Function dedicada à prestação de contas pública (“prestacao-publica”, sem exigência de autenticação), o que evidencia que a camada de dados para um site público mais completo já está tecnicamente disponível, restando qualificar sua arquitetura de informação, o design de interface e a experiência do usuário para os diferentes públicos de interesse do projeto (UNESCO/doadores, gestão pública, sociedade civil e imprensa).</w:t>
+        <w:t>A divulgação pública dessa execução ocorre hoje por meio de um painel público de página única, com três abas: (i) Mapa de Entregas — mapa interativo com pontos e geometrias das entregas em campo, filtros por APA e tipo de atividade, camadas geográficas, fotos e vídeos; (ii) Painel Geral — indicadores-chave de atividades, TDRs aprovados, produtos entregues e indicadores com progresso, com gráficos do pipeline de contratação; e (iii) Matriz de Resultados — indicadores agrupados por resultado e produto, com barras de progresso e vinculação aos ODS. Esses painéis são alimentados por funções de banco de dados de acesso público (fn_publico_operacional, fn_publico_resultados, fn_publico_mapa, fn_publico_camadas e fn_publico_tipos_mapa), que expõem exclusivamente dados agregados — modelo de segurança adequado, que deverá ser mantido e ampliado.</w:t>
+      </w:r>
+    </w:p>
+    <w:p>
+      <w:pPr/>
+      <w:r>
+        <w:rPr>
+          <w:b w:val="0"/>
+          <w:i w:val="0"/>
+        </w:rPr>
+        <w:t>O diagnóstico técnico preliminar do painel atual identificou, contudo, lacunas relevantes para um canal oficial de prestação de contas: ausência total de dados financeiros públicos (orçamento, percentual executado, execução por resultado), embora a plataforma registre a execução financeira completa; ausência de linha do tempo do projeto e de galeria dos produtos técnicos aprovados; ausência de página institucional (financiadores, executores, objetivos, documentos públicos); arquitetura monolítica em arquivo único de cerca de 1.500 linhas, que dificulta manutenção e evolução; conteúdo integralmente carregado por JavaScript, sem metadados para mecanismos de busca e compartilhamento em redes sociais (SEO/Open Graph); acessibilidade digital não auditada; e disponibilidade apenas em português, embora o público inclua doadores e instituições internacionais (UNESCO/ONU).</w:t>
       </w:r>
     </w:p>
     <w:p>
@@ -292,7 +302,7 @@
           <w:b w:val="0"/>
           <w:i w:val="0"/>
         </w:rPr>
-        <w:t>A equipe técnica e de coordenação do projeto não dispõe de capacidade dedicada em desenvolvimento web e design de interface para estruturar e manter um site público à altura da complexidade dos dados já geridos pela Plataforma DIMA. A página pública atual foi construída de forma pontual, sem arquitetura de informação, identidade visual consolidada ou visualização de dados adequada ao volume de informação disponível nos módulos de atividades, financeiro, produtos, viagens e matriz de indicadores.</w:t>
+        <w:t>A equipe técnica e de coordenação do projeto não dispõe de capacidade dedicada em desenvolvimento web e design de interface para estruturar e manter um site público à altura da complexidade dos dados já geridos pela Plataforma DIMA. O painel público atual foi construído de forma incremental, como extensão visual do sistema interno, sem identidade própria de comunicação pública, sem arquitetura de informação orientada aos públicos-alvo e sem cobertura dos dados de maior interesse para a prestação de contas — em especial a execução financeira, hoje ausente do canal público.</w:t>
       </w:r>
     </w:p>
     <w:p>
@@ -302,7 +312,7 @@
           <w:b w:val="0"/>
           <w:i w:val="0"/>
         </w:rPr>
-        <w:t>É necessário, portanto, um profissional especializado para conduzir o diagnóstico dos dados passíveis de publicização, desenhar a solução de interface e desenvolver o site público, reaproveitando o backend Supabase e as Edge Functions já existentes, seguindo os padrões de código já adotados na Plataforma DIMA (HTML5, CSS3 e JavaScript puro) e assegurando responsividade, acessibilidade e desempenho adequados a um canal oficial de comunicação do projeto.</w:t>
+        <w:t>É necessário, portanto, um profissional especializado para conduzir o diagnóstico dos dados passíveis de publicização (incluindo a proposição de regra formal de privacidade para dados financeiros, publicados apenas de forma agregada, nunca por contrato ou fornecedor), desenhar a solução de interface e desenvolver o site público multipágina, reaproveitando o backend Supabase, as funções públicas de banco de dados já validadas e os componentes de mapa e matriz existentes (a serem portados, não reescritos), seguindo os padrões de código já adotados na Plataforma DIMA (HTML5, CSS3 e JavaScript puro, sem etapa de build) e assegurando responsividade, acessibilidade e desempenho adequados a um canal oficial de comunicação do projeto.</w:t>
       </w:r>
     </w:p>
     <w:p>
@@ -318,7 +328,7 @@
         <w:pStyle w:val="Heading2"/>
       </w:pPr>
       <w:r>
-        <w:t>Produto 1: Diagnóstico de Dados e Arquitetura de Informação da Plataforma DIMA</w:t>
+        <w:t>Produto 1: Diagnóstico de Dados, Regra de Privacidade e Arquitetura de Informação</w:t>
       </w:r>
     </w:p>
     <w:p>
@@ -341,33 +351,59 @@
         <w:jc w:val="both"/>
       </w:pPr>
       <w:r>
-        <w:t>Levantamento e análise das fontes de dados passíveis de divulgação pública na Plataforma DIMA (atividades e suas fases de execução, execução financeira agregada por atividade, produtos técnicos aprovados, indicadores da matriz de contribuição, viagens e missões de campo agregadas), com base no schema do banco de dados e nas Edge Functions existentes (ex.: prestacao-publica).</w:t>
-      </w:r>
-    </w:p>
-    <w:p>
-      <w:pPr>
-        <w:numPr>
-          <w:ilvl w:val="0"/>
-          <w:numId w:val="1"/>
-        </w:numPr>
-        <w:ind w:left="714" w:hanging="357"/>
-        <w:jc w:val="both"/>
-      </w:pPr>
-      <w:r>
-        <w:t>Definição da arquitetura de informação do site público (mapa do site, hierarquia de conteúdo e jornadas de navegação para os diferentes públicos: UNESCO/doadores, gestão pública, sociedade civil e imprensa).</w:t>
-      </w:r>
-    </w:p>
-    <w:p>
-      <w:pPr>
-        <w:numPr>
-          <w:ilvl w:val="0"/>
-          <w:numId w:val="1"/>
-        </w:numPr>
-        <w:ind w:left="714" w:hanging="357"/>
-        <w:jc w:val="both"/>
-      </w:pPr>
-      <w:r>
-        <w:t>Elaboração de documento técnico de diagnóstico e arquitetura de informação, incluindo wireframes de baixa fidelidade das principais páginas (página inicial, mapa de entregas, painel de indicadores, execução financeira, linha do tempo do projeto e página institucional).</w:t>
+        <w:t>Inventário completo das fontes de dados passíveis de divulgação pública na Plataforma DIMA (atividades e fases, execução financeira agregada, produtos técnicos aprovados, indicadores da matriz de contribuição, geometrias e registros do mapa de entregas), com base no schema do banco de dados e nas funções públicas existentes (fn_publico_operacional, fn_publico_resultados, fn_publico_mapa, fn_publico_camadas, fn_publico_tipos_mapa), incluindo auditoria de qualidade e completude dos dados a exibir.</w:t>
+      </w:r>
+    </w:p>
+    <w:p>
+      <w:pPr>
+        <w:numPr>
+          <w:ilvl w:val="0"/>
+          <w:numId w:val="1"/>
+        </w:numPr>
+        <w:ind w:left="714" w:hanging="357"/>
+        <w:jc w:val="both"/>
+      </w:pPr>
+      <w:r>
+        <w:t>Proposição de regra formal de privacidade e publicidade de dados, a ser aprovada pela coordenação, estabelecendo que dados financeiros sejam publicados exclusivamente de forma agregada por resultado e atividade (nunca por contrato ou fornecedor) e que produtos técnicos sejam publicados apenas mediante marcação explícita de publicação.</w:t>
+      </w:r>
+    </w:p>
+    <w:p>
+      <w:pPr>
+        <w:numPr>
+          <w:ilvl w:val="0"/>
+          <w:numId w:val="1"/>
+        </w:numPr>
+        <w:ind w:left="714" w:hanging="357"/>
+        <w:jc w:val="both"/>
+      </w:pPr>
+      <w:r>
+        <w:t>Especificação técnica das novas funções públicas de banco de dados necessárias ao site (execução financeira agregada, linha do tempo de eventos públicos, galeria de produtos publicáveis e resumo consolidado da página inicial), seguindo o modelo de segurança já validado (funções de acesso público que expõem somente agregados).</w:t>
+      </w:r>
+    </w:p>
+    <w:p>
+      <w:pPr>
+        <w:numPr>
+          <w:ilvl w:val="0"/>
+          <w:numId w:val="1"/>
+        </w:numPr>
+        <w:ind w:left="714" w:hanging="357"/>
+        <w:jc w:val="both"/>
+      </w:pPr>
+      <w:r>
+        <w:t>Definição da arquitetura de informação do site público — mapa do site com, no mínimo, 7 páginas (Início, Mapa de Entregas, Resultados, Transparência Financeira, Linha do Tempo, Produtos e Sobre o Projeto) — e das jornadas de navegação para os públicos-alvo (UNESCO/doadores, gestão pública, sociedade civil e imprensa).</w:t>
+      </w:r>
+    </w:p>
+    <w:p>
+      <w:pPr>
+        <w:numPr>
+          <w:ilvl w:val="0"/>
+          <w:numId w:val="1"/>
+        </w:numPr>
+        <w:ind w:left="714" w:hanging="357"/>
+        <w:jc w:val="both"/>
+      </w:pPr>
+      <w:r>
+        <w:t>Elaboração de documento técnico de diagnóstico e arquitetura de informação, incluindo wireframes de baixa fidelidade das páginas e a recomendação fundamentada do ambiente de hospedagem (GitHub Pages ou equivalente já em uso pelo projeto).</w:t>
       </w:r>
     </w:p>
     <w:p>
@@ -398,20 +434,20 @@
         <w:jc w:val="both"/>
       </w:pPr>
       <w:r>
-        <w:t>Definição da identidade visual do site (paleta de cores, tipografia, componentes de interface), alinhada às diretrizes de comunicação da UNESCO e da SEMA/AC e aos princípios de acessibilidade digital (WCAG).</w:t>
-      </w:r>
-    </w:p>
-    <w:p>
-      <w:pPr>
-        <w:numPr>
-          <w:ilvl w:val="0"/>
-          <w:numId w:val="1"/>
-        </w:numPr>
-        <w:ind w:left="714" w:hanging="357"/>
-        <w:jc w:val="both"/>
-      </w:pPr>
-      <w:r>
-        <w:t>Elaboração de protótipo navegável de alta fidelidade contemplando, no mínimo: página inicial, mapa interativo de entregas, painel de indicadores da matriz de resultados, painel de execução financeira consolidada, linha do tempo do projeto e página “Sobre o Projeto”.</w:t>
+        <w:t>Definição da identidade visual própria do site público (paleta de cores derivada da identidade institucional, tipografia, grade de layout e biblioteca de componentes reutilizáveis — design tokens), alinhada às diretrizes de comunicação da UNESCO e da SEMA/AC, distinta da interface do sistema interno de gestão.</w:t>
+      </w:r>
+    </w:p>
+    <w:p>
+      <w:pPr>
+        <w:numPr>
+          <w:ilvl w:val="0"/>
+          <w:numId w:val="1"/>
+        </w:numPr>
+        <w:ind w:left="714" w:hanging="357"/>
+        <w:jc w:val="both"/>
+      </w:pPr>
+      <w:r>
+        <w:t>Elaboração de protótipo navegável de alta fidelidade das 7 páginas definidas no Produto 1, com versões desktop e mobile (abordagem mobile-first), contemplando a apresentação dos dados como narrativa contextualizada (números sempre acompanhados de contexto), e com conformidade de contraste e legibilidade verificada já na fase de design (WCAG 2.1 AA).</w:t>
       </w:r>
     </w:p>
     <w:p>
@@ -432,7 +468,7 @@
         <w:pStyle w:val="Heading2"/>
       </w:pPr>
       <w:r>
-        <w:t>Produto 3: Desenvolvimento Frontend e Integração com a Plataforma DIMA (Supabase)</w:t>
+        <w:t>Produto 3: Desenvolvimento Frontend, Novas Funções de Dados e Integração</w:t>
       </w:r>
     </w:p>
     <w:p>
@@ -455,33 +491,46 @@
         <w:jc w:val="both"/>
       </w:pPr>
       <w:r>
-        <w:t>Desenvolvimento do site público em HTML5, CSS3 e JavaScript, seguindo os padrões de código já adotados na Plataforma DIMA.</w:t>
-      </w:r>
-    </w:p>
-    <w:p>
-      <w:pPr>
-        <w:numPr>
-          <w:ilvl w:val="0"/>
-          <w:numId w:val="1"/>
-        </w:numPr>
-        <w:ind w:left="714" w:hanging="357"/>
-        <w:jc w:val="both"/>
-      </w:pPr>
-      <w:r>
-        <w:t>Integração com o backend Supabase, por meio de consultas públicas controladas por RLS e/ou Edge Functions (ex.: prestacao-publica), para exibição de dados atualizados de execução física e financeira do projeto, sem exposição de dados sensíveis ou pessoais (ex.: dados individuais de fornecedores, valores nominais de contratos com terceiros, dados de usuários do sistema).</w:t>
-      </w:r>
-    </w:p>
-    <w:p>
-      <w:pPr>
-        <w:numPr>
-          <w:ilvl w:val="0"/>
-          <w:numId w:val="1"/>
-        </w:numPr>
-        <w:ind w:left="714" w:hanging="357"/>
-        <w:jc w:val="both"/>
-      </w:pPr>
-      <w:r>
-        <w:t>Implementação de visualizações de dados responsivas para desktop e dispositivos móveis (mapa de entregas, gráficos de indicadores, linha do tempo de execução e cartões de indicadores-chave).</w:t>
+        <w:t>Desenvolvimento do site público multipágina em HTML5, CSS3 e JavaScript puro (sem etapa de build), em estrutura modular de arquivos (folhas de estilo com design tokens, componentes compartilhados de cabeçalho/rodapé e módulo único de acesso a dados), superando a atual arquitetura de arquivo único, com conteúdo institucional pré-renderizado no HTML para indexação por mecanismos de busca.</w:t>
+      </w:r>
+    </w:p>
+    <w:p>
+      <w:pPr>
+        <w:numPr>
+          <w:ilvl w:val="0"/>
+          <w:numId w:val="1"/>
+        </w:numPr>
+        <w:ind w:left="714" w:hanging="357"/>
+        <w:jc w:val="both"/>
+      </w:pPr>
+      <w:r>
+        <w:t>Implementação, via migrações SQL versionadas, das novas funções públicas de banco de dados especificadas no Produto 1, respeitando a regra de privacidade aprovada (somente agregados; sem dados nominais de fornecedores, valores de contratos individuais ou dados pessoais), com validação prévia em ambiente de homologação.</w:t>
+      </w:r>
+    </w:p>
+    <w:p>
+      <w:pPr>
+        <w:numPr>
+          <w:ilvl w:val="0"/>
+          <w:numId w:val="1"/>
+        </w:numPr>
+        <w:ind w:left="714" w:hanging="357"/>
+        <w:jc w:val="both"/>
+      </w:pPr>
+      <w:r>
+        <w:t>Portabilidade (não reescrita) do mapa interativo de entregas e da matriz de resultados existentes para a nova base de código, com melhorias de usabilidade em dispositivos móveis, e desenvolvimento das novas páginas de Transparência Financeira, Linha do Tempo, Galeria de Produtos e Sobre o Projeto, com visualizações de dados responsivas.</w:t>
+      </w:r>
+    </w:p>
+    <w:p>
+      <w:pPr>
+        <w:numPr>
+          <w:ilvl w:val="0"/>
+          <w:numId w:val="1"/>
+        </w:numPr>
+        <w:ind w:left="714" w:hanging="357"/>
+        <w:jc w:val="both"/>
+      </w:pPr>
+      <w:r>
+        <w:t>Disponibilização das páginas-chave (Início, Sobre e Transparência) também em inglês, redirecionamento permanente da página pública anterior para o novo site e internalização (vendorização) das bibliotecas externas de mapa e gráficos para eliminar dependência de CDNs de terceiros.</w:t>
       </w:r>
     </w:p>
     <w:p>
@@ -512,33 +561,33 @@
         <w:jc w:val="both"/>
       </w:pPr>
       <w:r>
-        <w:t>Realização de testes funcionais, de responsividade, de desempenho e de acessibilidade digital (WCAG 2.1, nível AA), com os respectivos ajustes de correção.</w:t>
-      </w:r>
-    </w:p>
-    <w:p>
-      <w:pPr>
-        <w:numPr>
-          <w:ilvl w:val="0"/>
-          <w:numId w:val="1"/>
-        </w:numPr>
-        <w:ind w:left="714" w:hanging="357"/>
-        <w:jc w:val="both"/>
-      </w:pPr>
-      <w:r>
-        <w:t>Otimização técnica para mecanismos de busca (SEO técnico, metadados e Open Graph) e publicação do site no ambiente de hospedagem definido pela SEMA/AC, compatível com o padrão já adotado pela Plataforma DIMA (GitHub Pages).</w:t>
-      </w:r>
-    </w:p>
-    <w:p>
-      <w:pPr>
-        <w:numPr>
-          <w:ilvl w:val="0"/>
-          <w:numId w:val="1"/>
-        </w:numPr>
-        <w:ind w:left="714" w:hanging="357"/>
-        <w:jc w:val="both"/>
-      </w:pPr>
-      <w:r>
-        <w:t>Elaboração de documentação técnica (estrutura de dados consumidos, instruções de atualização de conteúdo) e realização de sessão de capacitação para a equipe técnica da SEMA/UNESCO responsável pela manutenção básica do site.</w:t>
+        <w:t>Realização de testes funcionais e de responsividade em navegadores e dispositivos representativos (Chrome, Firefox e Safari; Android e iOS), auditoria de acessibilidade digital (WCAG 2.1, nível AA) e auditoria de segurança das funções públicas (verificação de que nenhuma consulta pública expõe dados além dos agregados aprovados), com os respectivos ajustes de correção.</w:t>
+      </w:r>
+    </w:p>
+    <w:p>
+      <w:pPr>
+        <w:numPr>
+          <w:ilvl w:val="0"/>
+          <w:numId w:val="1"/>
+        </w:numPr>
+        <w:ind w:left="714" w:hanging="357"/>
+        <w:jc w:val="both"/>
+      </w:pPr>
+      <w:r>
+        <w:t>Otimização técnica para mecanismos de busca e compartilhamento (metadados, Open Graph, sitemap.xml e robots.txt), com meta mínima de pontuação 90 nas categorias Performance, Acessibilidade, Boas Práticas e SEO da ferramenta Lighthouse, e publicação do site no ambiente de produção definido no Produto 1, com acompanhamento pós-lançamento.</w:t>
+      </w:r>
+    </w:p>
+    <w:p>
+      <w:pPr>
+        <w:numPr>
+          <w:ilvl w:val="0"/>
+          <w:numId w:val="1"/>
+        </w:numPr>
+        <w:ind w:left="714" w:hanging="357"/>
+        <w:jc w:val="both"/>
+      </w:pPr>
+      <w:r>
+        <w:t>Elaboração de documentação técnica (arquitetura do site, funções de dados consumidas, instruções de atualização de conteúdo e de publicação) e realização de sessão de capacitação para a equipe técnica da SEMA/UNESCO responsável pela manutenção básica do site, com relatório final consolidado.</w:t>
       </w:r>
     </w:p>
     <w:p>
@@ -864,7 +913,7 @@
           <w:b w:val="0"/>
           <w:i w:val="0"/>
         </w:rPr>
-        <w:t>O consultor terá acesso à documentação técnica da Plataforma DIMA (estrutura de tabelas, enums e Edge Functions), a ambiente de testes/homologação no projeto Supabase (Projeto-SEMA-UNESCO), a diretrizes de comunicação visual da UNESCO e da SEMA/AC, e ao apoio da equipe de coordenação para validação de conteúdo, priorização de indicadores e definição do ambiente de publicação.</w:t>
+        <w:t>O consultor terá acesso ao repositório de código da Plataforma DIMA (incluindo o painel público atual e seus componentes de mapa e matriz de resultados), à documentação técnica do sistema (estrutura de tabelas, enums, funções públicas de banco de dados e Edge Functions), a ambiente de testes/homologação no projeto Supabase (Projeto-SEMA-UNESCO), aos ativos de identidade visual institucional (logos do Governo do Acre, SEMA/AC, UNESCO, ONU Brasil, Fundo Brasil-ONU e Consórcio Amazônia Legal, já reunidos no repositório), a diretrizes de comunicação visual da UNESCO e da SEMA/AC, e ao apoio da equipe de coordenação para validação de conteúdo, aprovação da regra de privacidade de dados, priorização de indicadores e definição do ambiente de publicação. A coordenação se reunirá quinzenalmente com o consultor para acompanhamento da execução.</w:t>
       </w:r>
     </w:p>
     <w:p>
@@ -988,6 +1037,19 @@
       </w:pPr>
       <w:r>
         <w:t>Familiaridade com Supabase (PostgreSQL, Auth, RLS e Edge Functions em Deno/TypeScript).</w:t>
+      </w:r>
+    </w:p>
+    <w:p>
+      <w:pPr>
+        <w:numPr>
+          <w:ilvl w:val="0"/>
+          <w:numId w:val="1"/>
+        </w:numPr>
+        <w:ind w:left="714" w:hanging="357"/>
+        <w:jc w:val="both"/>
+      </w:pPr>
+      <w:r>
+        <w:t>Experiência com bibliotecas de mapas interativos (Leaflet ou similar) e de visualização de dados (Chart.js, D3 ou similar).</w:t>
       </w:r>
     </w:p>
     <w:p>

</xml_diff>